<commit_message>
Revision UTS PA 2
</commit_message>
<xml_diff>
--- a/Matakuliah/06. Pengantar Akuntansi 2/02. UTS/Pengantar Akuntansi 2.docx
+++ b/Matakuliah/06. Pengantar Akuntansi 2/02. UTS/Pengantar Akuntansi 2.docx
@@ -1488,7 +1488,7 @@
           <w:noProof/>
         </w:rPr>
         <w:drawing>
-          <wp:anchor distT="0" distB="0" distL="114300" distR="114300" simplePos="0" relativeHeight="251660288" behindDoc="1" locked="0" layoutInCell="1" allowOverlap="1" wp14:anchorId="72A88F84" wp14:editId="54A3F535">
+          <wp:anchor distT="0" distB="0" distL="114300" distR="114300" simplePos="0" relativeHeight="251660288" behindDoc="1" locked="0" layoutInCell="1" allowOverlap="1" wp14:anchorId="72A88F84" wp14:editId="4273FAC4">
             <wp:simplePos x="0" y="0"/>
             <wp:positionH relativeFrom="column">
               <wp:posOffset>45720</wp:posOffset>
@@ -1985,6 +1985,7 @@
         <w:spacing w:line="276" w:lineRule="auto"/>
         <w:ind w:left="284"/>
         <w:contextualSpacing/>
+        <w:jc w:val="both"/>
         <w:rPr>
           <w:rFonts w:ascii="Arial" w:hAnsi="Arial" w:cs="Arial"/>
           <w:sz w:val="18"/>
@@ -2247,6 +2248,7 @@
         <w:spacing w:line="276" w:lineRule="auto"/>
         <w:ind w:left="284"/>
         <w:contextualSpacing/>
+        <w:jc w:val="both"/>
         <w:rPr>
           <w:rFonts w:ascii="Arial" w:hAnsi="Arial" w:cs="Arial"/>
           <w:sz w:val="18"/>
@@ -2363,6 +2365,7 @@
         </w:numPr>
         <w:spacing w:line="276" w:lineRule="auto"/>
         <w:contextualSpacing/>
+        <w:jc w:val="both"/>
         <w:rPr>
           <w:rFonts w:ascii="Arial" w:hAnsi="Arial" w:cs="Arial"/>
           <w:sz w:val="18"/>
@@ -2528,6 +2531,7 @@
         </w:numPr>
         <w:spacing w:line="276" w:lineRule="auto"/>
         <w:contextualSpacing/>
+        <w:jc w:val="both"/>
         <w:rPr>
           <w:rFonts w:ascii="Arial" w:hAnsi="Arial" w:cs="Arial"/>
           <w:sz w:val="18"/>
@@ -2693,6 +2697,7 @@
         </w:numPr>
         <w:spacing w:line="276" w:lineRule="auto"/>
         <w:contextualSpacing/>
+        <w:jc w:val="both"/>
         <w:rPr>
           <w:rFonts w:ascii="Arial" w:hAnsi="Arial" w:cs="Arial"/>
           <w:sz w:val="18"/>
@@ -2858,6 +2863,7 @@
         </w:numPr>
         <w:spacing w:line="276" w:lineRule="auto"/>
         <w:contextualSpacing/>
+        <w:jc w:val="both"/>
         <w:rPr>
           <w:rFonts w:ascii="Arial" w:hAnsi="Arial" w:cs="Arial"/>
           <w:sz w:val="18"/>
@@ -3020,6 +3026,7 @@
         <w:spacing w:line="276" w:lineRule="auto"/>
         <w:ind w:left="284"/>
         <w:contextualSpacing/>
+        <w:jc w:val="both"/>
         <w:rPr>
           <w:rFonts w:ascii="Arial" w:hAnsi="Arial" w:cs="Arial"/>
           <w:sz w:val="18"/>
@@ -3688,6 +3695,7 @@
         <w:spacing w:line="276" w:lineRule="auto"/>
         <w:ind w:left="284"/>
         <w:contextualSpacing/>
+        <w:jc w:val="both"/>
         <w:rPr>
           <w:rFonts w:ascii="Arial" w:hAnsi="Arial" w:cs="Arial"/>
           <w:b/>
@@ -3738,6 +3746,7 @@
         <w:spacing w:line="276" w:lineRule="auto"/>
         <w:ind w:left="284"/>
         <w:contextualSpacing/>
+        <w:jc w:val="both"/>
         <w:rPr>
           <w:rFonts w:ascii="Arial" w:hAnsi="Arial" w:cs="Arial"/>
           <w:sz w:val="18"/>
@@ -5082,6 +5091,7 @@
         <w:spacing w:line="276" w:lineRule="auto"/>
         <w:ind w:left="284"/>
         <w:contextualSpacing/>
+        <w:jc w:val="both"/>
         <w:rPr>
           <w:rFonts w:ascii="Arial" w:hAnsi="Arial" w:cs="Arial"/>
           <w:sz w:val="18"/>
@@ -5336,6 +5346,7 @@
         <w:spacing w:line="276" w:lineRule="auto"/>
         <w:ind w:left="284"/>
         <w:contextualSpacing/>
+        <w:jc w:val="both"/>
         <w:rPr>
           <w:rFonts w:ascii="Arial" w:hAnsi="Arial" w:cs="Arial"/>
           <w:sz w:val="18"/>
@@ -5416,6 +5427,7 @@
         <w:spacing w:line="276" w:lineRule="auto"/>
         <w:ind w:left="709"/>
         <w:contextualSpacing/>
+        <w:jc w:val="both"/>
         <w:rPr>
           <w:rFonts w:ascii="Arial" w:hAnsi="Arial" w:cs="Arial"/>
           <w:sz w:val="18"/>
@@ -5701,6 +5713,7 @@
         </w:numPr>
         <w:spacing w:line="276" w:lineRule="auto"/>
         <w:contextualSpacing/>
+        <w:jc w:val="both"/>
         <w:rPr>
           <w:rFonts w:ascii="Arial" w:hAnsi="Arial" w:cs="Arial"/>
           <w:sz w:val="18"/>
@@ -5846,6 +5859,7 @@
           <w:numId w:val="11"/>
         </w:numPr>
         <w:spacing w:line="276" w:lineRule="auto"/>
+        <w:jc w:val="both"/>
         <w:rPr>
           <w:rFonts w:ascii="Arial" w:hAnsi="Arial" w:cs="Arial"/>
           <w:sz w:val="18"/>
@@ -5871,6 +5885,7 @@
           <w:numId w:val="11"/>
         </w:numPr>
         <w:spacing w:line="276" w:lineRule="auto"/>
+        <w:jc w:val="both"/>
         <w:rPr>
           <w:rFonts w:ascii="Arial" w:hAnsi="Arial" w:cs="Arial"/>
           <w:sz w:val="18"/>
@@ -5896,6 +5911,7 @@
           <w:numId w:val="11"/>
         </w:numPr>
         <w:spacing w:line="276" w:lineRule="auto"/>
+        <w:jc w:val="both"/>
         <w:rPr>
           <w:rFonts w:ascii="Arial" w:hAnsi="Arial" w:cs="Arial"/>
           <w:sz w:val="18"/>
@@ -5921,6 +5937,7 @@
           <w:numId w:val="11"/>
         </w:numPr>
         <w:spacing w:line="276" w:lineRule="auto"/>
+        <w:jc w:val="both"/>
         <w:rPr>
           <w:rFonts w:ascii="Arial" w:hAnsi="Arial" w:cs="Arial"/>
           <w:sz w:val="18"/>
@@ -5946,6 +5963,7 @@
         </w:numPr>
         <w:spacing w:line="276" w:lineRule="auto"/>
         <w:contextualSpacing/>
+        <w:jc w:val="both"/>
         <w:rPr>
           <w:rFonts w:ascii="Arial" w:hAnsi="Arial" w:cs="Arial"/>
           <w:sz w:val="18"/>
@@ -6182,6 +6200,7 @@
         </w:numPr>
         <w:spacing w:line="276" w:lineRule="auto"/>
         <w:contextualSpacing/>
+        <w:jc w:val="both"/>
         <w:rPr>
           <w:rFonts w:ascii="Arial" w:hAnsi="Arial" w:cs="Arial"/>
           <w:sz w:val="18"/>
@@ -6435,6 +6454,7 @@
         <w:spacing w:line="276" w:lineRule="auto"/>
         <w:ind w:left="284"/>
         <w:contextualSpacing/>
+        <w:jc w:val="both"/>
         <w:rPr>
           <w:rFonts w:ascii="Arial" w:hAnsi="Arial" w:cs="Arial"/>
           <w:b/>
@@ -6450,6 +6470,7 @@
         <w:spacing w:line="276" w:lineRule="auto"/>
         <w:ind w:left="284"/>
         <w:contextualSpacing/>
+        <w:jc w:val="both"/>
         <w:rPr>
           <w:rFonts w:ascii="Arial" w:hAnsi="Arial" w:cs="Arial"/>
           <w:b/>
@@ -6548,6 +6569,7 @@
         <w:spacing w:line="276" w:lineRule="auto"/>
         <w:ind w:left="284"/>
         <w:contextualSpacing/>
+        <w:jc w:val="both"/>
         <w:rPr>
           <w:rFonts w:ascii="Arial" w:hAnsi="Arial" w:cs="Arial"/>
           <w:sz w:val="18"/>
@@ -6684,6 +6706,7 @@
         </w:numPr>
         <w:spacing w:line="276" w:lineRule="auto"/>
         <w:contextualSpacing/>
+        <w:jc w:val="both"/>
         <w:rPr>
           <w:rFonts w:ascii="Arial" w:hAnsi="Arial" w:cs="Arial"/>
           <w:sz w:val="18"/>
@@ -6860,6 +6883,7 @@
         </w:numPr>
         <w:spacing w:line="276" w:lineRule="auto"/>
         <w:contextualSpacing/>
+        <w:jc w:val="both"/>
         <w:rPr>
           <w:rFonts w:ascii="Arial" w:hAnsi="Arial" w:cs="Arial"/>
           <w:sz w:val="18"/>
@@ -6965,6 +6989,7 @@
         </w:numPr>
         <w:spacing w:line="276" w:lineRule="auto"/>
         <w:contextualSpacing/>
+        <w:jc w:val="both"/>
         <w:rPr>
           <w:rFonts w:ascii="Arial" w:hAnsi="Arial" w:cs="Arial"/>
           <w:sz w:val="18"/>
@@ -7070,7 +7095,185 @@
           <w:szCs w:val="18"/>
           <w:lang w:val="en-ID"/>
         </w:rPr>
-        <w:t xml:space="preserve"> Rp90.000.000.</w:t>
+        <w:t xml:space="preserve"> Rp90.000.000</w:t>
+      </w:r>
+      <w:r>
+        <w:rPr>
+          <w:rFonts w:ascii="Arial" w:hAnsi="Arial" w:cs="Arial"/>
+          <w:sz w:val="18"/>
+          <w:szCs w:val="18"/>
+          <w:lang w:val="en-ID"/>
+        </w:rPr>
+        <w:t xml:space="preserve"> (</w:t>
+      </w:r>
+      <w:proofErr w:type="spellStart"/>
+      <w:r>
+        <w:rPr>
+          <w:rFonts w:ascii="Arial" w:hAnsi="Arial" w:cs="Arial"/>
+          <w:sz w:val="18"/>
+          <w:szCs w:val="18"/>
+          <w:lang w:val="en-ID"/>
+        </w:rPr>
+        <w:t>gaji</w:t>
+      </w:r>
+      <w:proofErr w:type="spellEnd"/>
+      <w:r>
+        <w:rPr>
+          <w:rFonts w:ascii="Arial" w:hAnsi="Arial" w:cs="Arial"/>
+          <w:sz w:val="18"/>
+          <w:szCs w:val="18"/>
+          <w:lang w:val="en-ID"/>
+        </w:rPr>
+        <w:t xml:space="preserve"> Andi Rp30.0000.000 dan </w:t>
+      </w:r>
+      <w:proofErr w:type="spellStart"/>
+      <w:r>
+        <w:rPr>
+          <w:rFonts w:ascii="Arial" w:hAnsi="Arial" w:cs="Arial"/>
+          <w:sz w:val="18"/>
+          <w:szCs w:val="18"/>
+          <w:lang w:val="en-ID"/>
+        </w:rPr>
+        <w:t>gaji</w:t>
+      </w:r>
+      <w:proofErr w:type="spellEnd"/>
+      <w:r>
+        <w:rPr>
+          <w:rFonts w:ascii="Arial" w:hAnsi="Arial" w:cs="Arial"/>
+          <w:sz w:val="18"/>
+          <w:szCs w:val="18"/>
+          <w:lang w:val="en-ID"/>
+        </w:rPr>
+        <w:t xml:space="preserve"> Budi Rp35.0000.000 </w:t>
+      </w:r>
+      <w:proofErr w:type="spellStart"/>
+      <w:r>
+        <w:rPr>
+          <w:rFonts w:ascii="Arial" w:hAnsi="Arial" w:cs="Arial"/>
+          <w:sz w:val="18"/>
+          <w:szCs w:val="18"/>
+          <w:lang w:val="en-ID"/>
+        </w:rPr>
+        <w:t>sedangkan</w:t>
+      </w:r>
+      <w:proofErr w:type="spellEnd"/>
+      <w:r>
+        <w:rPr>
+          <w:rFonts w:ascii="Arial" w:hAnsi="Arial" w:cs="Arial"/>
+          <w:sz w:val="18"/>
+          <w:szCs w:val="18"/>
+          <w:lang w:val="en-ID"/>
+        </w:rPr>
+        <w:t xml:space="preserve"> </w:t>
+      </w:r>
+      <w:proofErr w:type="spellStart"/>
+      <w:r>
+        <w:rPr>
+          <w:rFonts w:ascii="Arial" w:hAnsi="Arial" w:cs="Arial"/>
+          <w:sz w:val="18"/>
+          <w:szCs w:val="18"/>
+          <w:lang w:val="en-ID"/>
+        </w:rPr>
+        <w:t>sisanya</w:t>
+      </w:r>
+      <w:proofErr w:type="spellEnd"/>
+      <w:r>
+        <w:rPr>
+          <w:rFonts w:ascii="Arial" w:hAnsi="Arial" w:cs="Arial"/>
+          <w:sz w:val="18"/>
+          <w:szCs w:val="18"/>
+          <w:lang w:val="en-ID"/>
+        </w:rPr>
+        <w:t xml:space="preserve"> Adalah </w:t>
+      </w:r>
+      <w:proofErr w:type="spellStart"/>
+      <w:r>
+        <w:rPr>
+          <w:rFonts w:ascii="Arial" w:hAnsi="Arial" w:cs="Arial"/>
+          <w:sz w:val="18"/>
+          <w:szCs w:val="18"/>
+          <w:lang w:val="en-ID"/>
+        </w:rPr>
+        <w:t>gaji</w:t>
+      </w:r>
+      <w:proofErr w:type="spellEnd"/>
+      <w:r>
+        <w:rPr>
+          <w:rFonts w:ascii="Arial" w:hAnsi="Arial" w:cs="Arial"/>
+          <w:sz w:val="18"/>
+          <w:szCs w:val="18"/>
+          <w:lang w:val="en-ID"/>
+        </w:rPr>
+        <w:t xml:space="preserve"> </w:t>
+      </w:r>
+      <w:proofErr w:type="spellStart"/>
+      <w:r>
+        <w:rPr>
+          <w:rFonts w:ascii="Arial" w:hAnsi="Arial" w:cs="Arial"/>
+          <w:sz w:val="18"/>
+          <w:szCs w:val="18"/>
+          <w:lang w:val="en-ID"/>
+        </w:rPr>
+        <w:t>karyawan</w:t>
+      </w:r>
+      <w:proofErr w:type="spellEnd"/>
+      <w:r>
+        <w:rPr>
+          <w:rFonts w:ascii="Arial" w:hAnsi="Arial" w:cs="Arial"/>
+          <w:sz w:val="18"/>
+          <w:szCs w:val="18"/>
+          <w:lang w:val="en-ID"/>
+        </w:rPr>
+        <w:t xml:space="preserve"> </w:t>
+      </w:r>
+      <w:proofErr w:type="spellStart"/>
+      <w:r>
+        <w:rPr>
+          <w:rFonts w:ascii="Arial" w:hAnsi="Arial" w:cs="Arial"/>
+          <w:sz w:val="18"/>
+          <w:szCs w:val="18"/>
+          <w:lang w:val="en-ID"/>
+        </w:rPr>
+        <w:t>kantor</w:t>
+      </w:r>
+      <w:proofErr w:type="spellEnd"/>
+      <w:r>
+        <w:rPr>
+          <w:rFonts w:ascii="Arial" w:hAnsi="Arial" w:cs="Arial"/>
+          <w:sz w:val="18"/>
+          <w:szCs w:val="18"/>
+          <w:lang w:val="en-ID"/>
+        </w:rPr>
+        <w:t xml:space="preserve"> Persekutuan </w:t>
+      </w:r>
+      <w:proofErr w:type="spellStart"/>
+      <w:r>
+        <w:rPr>
+          <w:rFonts w:ascii="Arial" w:hAnsi="Arial" w:cs="Arial"/>
+          <w:sz w:val="18"/>
+          <w:szCs w:val="18"/>
+          <w:lang w:val="en-ID"/>
+        </w:rPr>
+        <w:t>tersebut</w:t>
+      </w:r>
+      <w:proofErr w:type="spellEnd"/>
+      <w:r>
+        <w:rPr>
+          <w:rFonts w:ascii="Arial" w:hAnsi="Arial" w:cs="Arial"/>
+          <w:sz w:val="18"/>
+          <w:szCs w:val="18"/>
+          <w:lang w:val="en-ID"/>
+        </w:rPr>
+        <w:t>)</w:t>
+      </w:r>
+      <w:r>
+        <w:rPr>
+          <w:rFonts w:ascii="Arial" w:hAnsi="Arial" w:cs="Arial"/>
+          <w:sz w:val="18"/>
+          <w:szCs w:val="18"/>
+          <w:lang w:val="en-ID"/>
+        </w:rPr>
+        <w:t>.</w:t>
       </w:r>
     </w:p>
     <w:p>
@@ -7081,6 +7284,7 @@
         </w:numPr>
         <w:spacing w:line="276" w:lineRule="auto"/>
         <w:contextualSpacing/>
+        <w:jc w:val="both"/>
         <w:rPr>
           <w:rFonts w:ascii="Arial" w:hAnsi="Arial" w:cs="Arial"/>
           <w:sz w:val="18"/>
@@ -7177,6 +7381,7 @@
         </w:numPr>
         <w:spacing w:line="276" w:lineRule="auto"/>
         <w:contextualSpacing/>
+        <w:jc w:val="both"/>
         <w:rPr>
           <w:rFonts w:ascii="Arial" w:hAnsi="Arial" w:cs="Arial"/>
           <w:sz w:val="18"/>
@@ -7273,6 +7478,7 @@
         </w:numPr>
         <w:spacing w:line="276" w:lineRule="auto"/>
         <w:contextualSpacing/>
+        <w:jc w:val="both"/>
         <w:rPr>
           <w:rFonts w:ascii="Arial" w:hAnsi="Arial" w:cs="Arial"/>
           <w:sz w:val="18"/>
@@ -7369,6 +7575,7 @@
         </w:numPr>
         <w:spacing w:line="276" w:lineRule="auto"/>
         <w:contextualSpacing/>
+        <w:jc w:val="both"/>
         <w:rPr>
           <w:rFonts w:ascii="Arial" w:hAnsi="Arial" w:cs="Arial"/>
           <w:sz w:val="18"/>
@@ -7485,6 +7692,7 @@
         </w:numPr>
         <w:spacing w:line="276" w:lineRule="auto"/>
         <w:contextualSpacing/>
+        <w:jc w:val="both"/>
         <w:rPr>
           <w:rFonts w:ascii="Arial" w:hAnsi="Arial" w:cs="Arial"/>
           <w:sz w:val="18"/>
@@ -7601,6 +7809,7 @@
         </w:numPr>
         <w:spacing w:line="276" w:lineRule="auto"/>
         <w:contextualSpacing/>
+        <w:jc w:val="both"/>
         <w:rPr>
           <w:rFonts w:ascii="Arial" w:hAnsi="Arial" w:cs="Arial"/>
           <w:sz w:val="18"/>
@@ -7934,6 +8143,7 @@
         <w:spacing w:line="276" w:lineRule="auto"/>
         <w:ind w:left="284"/>
         <w:contextualSpacing/>
+        <w:jc w:val="both"/>
         <w:rPr>
           <w:rFonts w:ascii="Arial" w:hAnsi="Arial" w:cs="Arial"/>
           <w:sz w:val="18"/>
@@ -8296,6 +8506,7 @@
         <w:spacing w:line="276" w:lineRule="auto"/>
         <w:ind w:left="284"/>
         <w:contextualSpacing/>
+        <w:jc w:val="both"/>
         <w:rPr>
           <w:rFonts w:ascii="Arial" w:hAnsi="Arial" w:cs="Arial"/>
           <w:b/>
@@ -8311,6 +8522,7 @@
         <w:spacing w:line="276" w:lineRule="auto"/>
         <w:ind w:left="284"/>
         <w:contextualSpacing/>
+        <w:jc w:val="both"/>
         <w:rPr>
           <w:rFonts w:ascii="Arial" w:hAnsi="Arial" w:cs="Arial"/>
           <w:b/>
@@ -8398,6 +8610,7 @@
         <w:spacing w:line="276" w:lineRule="auto"/>
         <w:ind w:left="284"/>
         <w:contextualSpacing/>
+        <w:jc w:val="both"/>
         <w:rPr>
           <w:rFonts w:ascii="Arial" w:hAnsi="Arial" w:cs="Arial"/>
           <w:sz w:val="18"/>
@@ -8920,6 +9133,7 @@
         <w:spacing w:line="276" w:lineRule="auto"/>
         <w:ind w:left="284"/>
         <w:contextualSpacing/>
+        <w:jc w:val="both"/>
         <w:rPr>
           <w:rFonts w:ascii="Arial" w:hAnsi="Arial" w:cs="Arial"/>
           <w:sz w:val="18"/>
@@ -9176,6 +9390,7 @@
         </w:numPr>
         <w:spacing w:line="276" w:lineRule="auto"/>
         <w:contextualSpacing/>
+        <w:jc w:val="both"/>
         <w:rPr>
           <w:rFonts w:ascii="Arial" w:hAnsi="Arial" w:cs="Arial"/>
           <w:sz w:val="18"/>
@@ -9361,6 +9576,7 @@
         </w:numPr>
         <w:spacing w:line="276" w:lineRule="auto"/>
         <w:contextualSpacing/>
+        <w:jc w:val="both"/>
         <w:rPr>
           <w:rFonts w:ascii="Arial" w:hAnsi="Arial" w:cs="Arial"/>
           <w:sz w:val="18"/>
@@ -9546,6 +9762,7 @@
         </w:numPr>
         <w:spacing w:line="276" w:lineRule="auto"/>
         <w:contextualSpacing/>
+        <w:jc w:val="both"/>
         <w:rPr>
           <w:rFonts w:ascii="Arial" w:hAnsi="Arial" w:cs="Arial"/>
           <w:sz w:val="18"/>
@@ -9782,6 +9999,7 @@
         </w:numPr>
         <w:spacing w:line="276" w:lineRule="auto"/>
         <w:contextualSpacing/>
+        <w:jc w:val="both"/>
         <w:rPr>
           <w:rFonts w:ascii="Arial" w:hAnsi="Arial" w:cs="Arial"/>
           <w:sz w:val="18"/>
@@ -10067,6 +10285,7 @@
         </w:numPr>
         <w:spacing w:line="276" w:lineRule="auto"/>
         <w:contextualSpacing/>
+        <w:jc w:val="both"/>
         <w:rPr>
           <w:rFonts w:ascii="Arial" w:hAnsi="Arial" w:cs="Arial"/>
           <w:sz w:val="18"/>
@@ -10272,6 +10491,7 @@
         </w:numPr>
         <w:spacing w:line="276" w:lineRule="auto"/>
         <w:contextualSpacing/>
+        <w:jc w:val="both"/>
         <w:rPr>
           <w:rFonts w:ascii="Arial" w:hAnsi="Arial" w:cs="Arial"/>
           <w:sz w:val="18"/>
@@ -10445,6 +10665,7 @@
         <w:spacing w:line="276" w:lineRule="auto"/>
         <w:ind w:left="284"/>
         <w:contextualSpacing/>
+        <w:jc w:val="both"/>
         <w:rPr>
           <w:rFonts w:ascii="Arial" w:hAnsi="Arial" w:cs="Arial"/>
           <w:sz w:val="18"/>
@@ -11077,6 +11298,7 @@
         <w:spacing w:line="276" w:lineRule="auto"/>
         <w:ind w:left="284"/>
         <w:contextualSpacing/>
+        <w:jc w:val="both"/>
         <w:rPr>
           <w:rFonts w:ascii="Arial" w:hAnsi="Arial" w:cs="Arial"/>
           <w:b/>
@@ -11189,6 +11411,7 @@
         <w:spacing w:line="276" w:lineRule="auto"/>
         <w:ind w:left="284"/>
         <w:contextualSpacing/>
+        <w:jc w:val="both"/>
         <w:rPr>
           <w:rFonts w:ascii="Arial" w:hAnsi="Arial" w:cs="Arial"/>
           <w:sz w:val="18"/>
@@ -11642,6 +11865,7 @@
         <w:spacing w:line="276" w:lineRule="auto"/>
         <w:ind w:left="284"/>
         <w:contextualSpacing/>
+        <w:jc w:val="both"/>
         <w:rPr>
           <w:rFonts w:ascii="Arial" w:hAnsi="Arial" w:cs="Arial"/>
           <w:sz w:val="18"/>
@@ -12637,6 +12861,7 @@
         <w:spacing w:line="276" w:lineRule="auto"/>
         <w:ind w:left="284"/>
         <w:contextualSpacing/>
+        <w:jc w:val="both"/>
         <w:rPr>
           <w:rFonts w:ascii="Arial" w:hAnsi="Arial" w:cs="Arial"/>
           <w:sz w:val="18"/>
@@ -13034,6 +13259,7 @@
         <w:spacing w:line="276" w:lineRule="auto"/>
         <w:ind w:left="284"/>
         <w:contextualSpacing/>
+        <w:jc w:val="both"/>
         <w:rPr>
           <w:rFonts w:ascii="Arial" w:hAnsi="Arial" w:cs="Arial"/>
           <w:b/>
@@ -13145,6 +13371,7 @@
         <w:spacing w:line="276" w:lineRule="auto"/>
         <w:ind w:left="284"/>
         <w:contextualSpacing/>
+        <w:jc w:val="both"/>
         <w:rPr>
           <w:rFonts w:ascii="Arial" w:hAnsi="Arial" w:cs="Arial"/>
           <w:sz w:val="18"/>
@@ -13337,6 +13564,7 @@
         <w:tc>
           <w:tcPr>
             <w:tcW w:w="0" w:type="auto"/>
+            <w:shd w:val="clear" w:color="auto" w:fill="DEEAF6" w:themeFill="accent1" w:themeFillTint="33"/>
             <w:vAlign w:val="center"/>
             <w:hideMark/>
           </w:tcPr>
@@ -13370,6 +13598,7 @@
         <w:tc>
           <w:tcPr>
             <w:tcW w:w="0" w:type="auto"/>
+            <w:shd w:val="clear" w:color="auto" w:fill="DEEAF6" w:themeFill="accent1" w:themeFillTint="33"/>
             <w:vAlign w:val="center"/>
             <w:hideMark/>
           </w:tcPr>
@@ -13416,6 +13645,7 @@
         <w:tc>
           <w:tcPr>
             <w:tcW w:w="0" w:type="auto"/>
+            <w:shd w:val="clear" w:color="auto" w:fill="DEEAF6" w:themeFill="accent1" w:themeFillTint="33"/>
             <w:vAlign w:val="center"/>
             <w:hideMark/>
           </w:tcPr>
@@ -13860,6 +14090,7 @@
         <w:spacing w:line="276" w:lineRule="auto"/>
         <w:ind w:left="284"/>
         <w:contextualSpacing/>
+        <w:jc w:val="both"/>
         <w:rPr>
           <w:rFonts w:ascii="Arial" w:hAnsi="Arial" w:cs="Arial"/>
           <w:sz w:val="18"/>
@@ -14362,6 +14593,7 @@
         <w:spacing w:line="276" w:lineRule="auto"/>
         <w:ind w:left="284"/>
         <w:contextualSpacing/>
+        <w:jc w:val="both"/>
         <w:rPr>
           <w:rFonts w:ascii="Arial" w:hAnsi="Arial" w:cs="Arial"/>
           <w:sz w:val="18"/>
@@ -14418,6 +14650,7 @@
         </w:numPr>
         <w:spacing w:line="276" w:lineRule="auto"/>
         <w:contextualSpacing/>
+        <w:jc w:val="both"/>
         <w:rPr>
           <w:rFonts w:ascii="Arial" w:hAnsi="Arial" w:cs="Arial"/>
           <w:sz w:val="18"/>
@@ -14714,6 +14947,7 @@
         </w:numPr>
         <w:spacing w:line="276" w:lineRule="auto"/>
         <w:contextualSpacing/>
+        <w:jc w:val="both"/>
         <w:rPr>
           <w:rFonts w:ascii="Arial" w:hAnsi="Arial" w:cs="Arial"/>
           <w:sz w:val="18"/>
@@ -14919,6 +15153,7 @@
         </w:numPr>
         <w:spacing w:line="276" w:lineRule="auto"/>
         <w:contextualSpacing/>
+        <w:jc w:val="both"/>
         <w:rPr>
           <w:rFonts w:ascii="Arial" w:hAnsi="Arial" w:cs="Arial"/>
           <w:sz w:val="18"/>
@@ -15184,6 +15419,7 @@
         </w:numPr>
         <w:spacing w:line="276" w:lineRule="auto"/>
         <w:contextualSpacing/>
+        <w:jc w:val="both"/>
         <w:rPr>
           <w:rFonts w:ascii="Arial" w:hAnsi="Arial" w:cs="Arial"/>
           <w:sz w:val="18"/>
@@ -15400,6 +15636,7 @@
         </w:numPr>
         <w:spacing w:line="276" w:lineRule="auto"/>
         <w:contextualSpacing/>
+        <w:jc w:val="both"/>
         <w:rPr>
           <w:rFonts w:ascii="Arial" w:hAnsi="Arial" w:cs="Arial"/>
           <w:sz w:val="18"/>
@@ -15625,6 +15862,7 @@
         </w:numPr>
         <w:spacing w:line="276" w:lineRule="auto"/>
         <w:contextualSpacing/>
+        <w:jc w:val="both"/>
         <w:rPr>
           <w:rFonts w:ascii="Arial" w:hAnsi="Arial" w:cs="Arial"/>
           <w:sz w:val="18"/>
@@ -15898,6 +16136,7 @@
         <w:spacing w:line="276" w:lineRule="auto"/>
         <w:ind w:left="284"/>
         <w:contextualSpacing/>
+        <w:jc w:val="both"/>
         <w:rPr>
           <w:rFonts w:ascii="Arial" w:hAnsi="Arial" w:cs="Arial"/>
           <w:b/>
@@ -15913,6 +16152,7 @@
         <w:spacing w:line="276" w:lineRule="auto"/>
         <w:ind w:left="284"/>
         <w:contextualSpacing/>
+        <w:jc w:val="both"/>
         <w:rPr>
           <w:rFonts w:ascii="Arial" w:hAnsi="Arial" w:cs="Arial"/>
           <w:b/>
@@ -15928,6 +16168,7 @@
         <w:spacing w:line="276" w:lineRule="auto"/>
         <w:ind w:left="284"/>
         <w:contextualSpacing/>
+        <w:jc w:val="both"/>
         <w:rPr>
           <w:rFonts w:ascii="Arial" w:hAnsi="Arial" w:cs="Arial"/>
           <w:b/>
@@ -15943,6 +16184,7 @@
         <w:spacing w:line="276" w:lineRule="auto"/>
         <w:ind w:left="284"/>
         <w:contextualSpacing/>
+        <w:jc w:val="both"/>
         <w:rPr>
           <w:rFonts w:ascii="Arial" w:hAnsi="Arial" w:cs="Arial"/>
           <w:b/>
@@ -15958,6 +16200,7 @@
         <w:spacing w:line="276" w:lineRule="auto"/>
         <w:ind w:left="284"/>
         <w:contextualSpacing/>
+        <w:jc w:val="both"/>
         <w:rPr>
           <w:rFonts w:ascii="Arial" w:hAnsi="Arial" w:cs="Arial"/>
           <w:b/>
@@ -15973,6 +16216,7 @@
         <w:spacing w:line="276" w:lineRule="auto"/>
         <w:ind w:left="284"/>
         <w:contextualSpacing/>
+        <w:jc w:val="both"/>
         <w:rPr>
           <w:rFonts w:ascii="Arial" w:hAnsi="Arial" w:cs="Arial"/>
           <w:b/>
@@ -15988,6 +16232,7 @@
         <w:spacing w:line="276" w:lineRule="auto"/>
         <w:ind w:left="284"/>
         <w:contextualSpacing/>
+        <w:jc w:val="both"/>
         <w:rPr>
           <w:rFonts w:ascii="Arial" w:hAnsi="Arial" w:cs="Arial"/>
           <w:b/>
@@ -16003,6 +16248,7 @@
         <w:spacing w:line="276" w:lineRule="auto"/>
         <w:ind w:left="284"/>
         <w:contextualSpacing/>
+        <w:jc w:val="both"/>
         <w:rPr>
           <w:rFonts w:ascii="Arial" w:hAnsi="Arial" w:cs="Arial"/>
           <w:b/>
@@ -16018,6 +16264,23 @@
         <w:spacing w:line="276" w:lineRule="auto"/>
         <w:ind w:left="284"/>
         <w:contextualSpacing/>
+        <w:jc w:val="both"/>
+        <w:rPr>
+          <w:rFonts w:ascii="Arial" w:hAnsi="Arial" w:cs="Arial"/>
+          <w:b/>
+          <w:bCs/>
+          <w:sz w:val="18"/>
+          <w:szCs w:val="18"/>
+          <w:lang w:val="en-ID"/>
+        </w:rPr>
+      </w:pPr>
+    </w:p>
+    <w:p>
+      <w:pPr>
+        <w:spacing w:line="276" w:lineRule="auto"/>
+        <w:ind w:left="284"/>
+        <w:contextualSpacing/>
+        <w:jc w:val="both"/>
         <w:rPr>
           <w:rFonts w:ascii="Arial" w:hAnsi="Arial" w:cs="Arial"/>
           <w:b/>
@@ -16098,6 +16361,7 @@
         </w:numPr>
         <w:spacing w:line="276" w:lineRule="auto"/>
         <w:contextualSpacing/>
+        <w:jc w:val="both"/>
         <w:rPr>
           <w:rFonts w:ascii="Arial" w:hAnsi="Arial" w:cs="Arial"/>
           <w:sz w:val="18"/>
@@ -16294,6 +16558,7 @@
         </w:numPr>
         <w:spacing w:line="276" w:lineRule="auto"/>
         <w:contextualSpacing/>
+        <w:jc w:val="both"/>
         <w:rPr>
           <w:rFonts w:ascii="Arial" w:hAnsi="Arial" w:cs="Arial"/>
           <w:sz w:val="18"/>
@@ -16379,6 +16644,7 @@
         </w:numPr>
         <w:spacing w:line="276" w:lineRule="auto"/>
         <w:contextualSpacing/>
+        <w:jc w:val="both"/>
         <w:rPr>
           <w:rFonts w:ascii="Arial" w:hAnsi="Arial" w:cs="Arial"/>
           <w:sz w:val="18"/>
@@ -16555,6 +16821,7 @@
         </w:numPr>
         <w:spacing w:line="276" w:lineRule="auto"/>
         <w:contextualSpacing/>
+        <w:jc w:val="both"/>
         <w:rPr>
           <w:rFonts w:ascii="Arial" w:hAnsi="Arial" w:cs="Arial"/>
           <w:sz w:val="18"/>
@@ -16751,6 +17018,7 @@
         </w:numPr>
         <w:spacing w:line="276" w:lineRule="auto"/>
         <w:contextualSpacing/>
+        <w:jc w:val="both"/>
         <w:rPr>
           <w:rFonts w:ascii="Arial" w:hAnsi="Arial" w:cs="Arial"/>
           <w:sz w:val="18"/>
@@ -16947,6 +17215,7 @@
         </w:numPr>
         <w:spacing w:line="276" w:lineRule="auto"/>
         <w:contextualSpacing/>
+        <w:jc w:val="both"/>
         <w:rPr>
           <w:rFonts w:ascii="Arial" w:hAnsi="Arial" w:cs="Arial"/>
           <w:sz w:val="18"/>
@@ -17112,6 +17381,7 @@
         </w:numPr>
         <w:spacing w:line="276" w:lineRule="auto"/>
         <w:contextualSpacing/>
+        <w:jc w:val="both"/>
         <w:rPr>
           <w:rFonts w:ascii="Arial" w:hAnsi="Arial" w:cs="Arial"/>
           <w:sz w:val="18"/>
@@ -17368,6 +17638,7 @@
         </w:numPr>
         <w:spacing w:line="276" w:lineRule="auto"/>
         <w:contextualSpacing/>
+        <w:jc w:val="both"/>
         <w:rPr>
           <w:rFonts w:ascii="Arial" w:hAnsi="Arial" w:cs="Arial"/>
           <w:sz w:val="18"/>
@@ -17644,6 +17915,7 @@
         </w:numPr>
         <w:spacing w:line="276" w:lineRule="auto"/>
         <w:contextualSpacing/>
+        <w:jc w:val="both"/>
         <w:rPr>
           <w:rFonts w:ascii="Arial" w:hAnsi="Arial" w:cs="Arial"/>
           <w:sz w:val="18"/>
@@ -17860,6 +18132,7 @@
         </w:numPr>
         <w:spacing w:line="276" w:lineRule="auto"/>
         <w:contextualSpacing/>
+        <w:jc w:val="both"/>
         <w:rPr>
           <w:rFonts w:ascii="Arial" w:hAnsi="Arial" w:cs="Arial"/>
           <w:sz w:val="18"/>
@@ -18136,6 +18409,7 @@
         </w:numPr>
         <w:spacing w:line="276" w:lineRule="auto"/>
         <w:contextualSpacing/>
+        <w:jc w:val="both"/>
         <w:rPr>
           <w:rFonts w:ascii="Arial" w:hAnsi="Arial" w:cs="Arial"/>
           <w:sz w:val="18"/>
@@ -18272,6 +18546,7 @@
         </w:numPr>
         <w:spacing w:line="276" w:lineRule="auto"/>
         <w:contextualSpacing/>
+        <w:jc w:val="both"/>
         <w:rPr>
           <w:rFonts w:ascii="Arial" w:hAnsi="Arial" w:cs="Arial"/>
           <w:sz w:val="18"/>
@@ -18597,6 +18872,7 @@
         </w:numPr>
         <w:spacing w:line="276" w:lineRule="auto"/>
         <w:contextualSpacing/>
+        <w:jc w:val="both"/>
         <w:rPr>
           <w:rFonts w:ascii="Arial" w:hAnsi="Arial" w:cs="Arial"/>
           <w:sz w:val="18"/>
@@ -20693,6 +20969,7 @@
   <w:style w:type="character" w:default="1" w:styleId="DefaultParagraphFont">
     <w:name w:val="Default Paragraph Font"/>
     <w:uiPriority w:val="1"/>
+    <w:semiHidden/>
     <w:unhideWhenUsed/>
   </w:style>
   <w:style w:type="table" w:default="1" w:styleId="TableNormal">

</xml_diff>